<commit_message>
Update publications, grants, and positions
- Record The Optional Firm as forthcoming in European Business Law Review
  (moved from working papers to peer-reviewed journals; full title added)
- Remove the 2024 Vanderbilt secondary-sales research grant
- Add 2026 Stanford Law School visiting scholarship

Co-Authored-By: Claude Opus 5 (1M context) <noreply@anthropic.com>
</commit_message>
<xml_diff>
--- a/Yifat Aran CV 2026 April 29.docx
+++ b/Yifat Aran CV 2026 April 29.docx
@@ -440,6 +440,42 @@
           <w:bCs/>
           <w:color w:val="000000" w:themeColor="text1"/>
         </w:rPr>
+        <w:t>Visiting Scholar</w:t>
+      </w:r>
+      <w:r>
+        <w:rPr>
+          <w:rFonts w:ascii="Garamond" w:hAnsi="Garamond"/>
+          <w:color w:val="000000" w:themeColor="text1"/>
+        </w:rPr>
+        <w:t>, Stanford University, Law School</w:t>
+      </w:r>
+      <w:r>
+        <w:rPr>
+          <w:rFonts w:ascii="Garamond" w:hAnsi="Garamond"/>
+          <w:color w:val="000000" w:themeColor="text1"/>
+        </w:rPr>
+        <w:tab/>
+        <w:t>2026</w:t>
+      </w:r>
+    </w:p>
+    <w:p>
+      <w:pPr>
+        <w:tabs>
+          <w:tab w:val="right" w:pos="9026"/>
+        </w:tabs>
+        <w:spacing w:after="60"/>
+        <w:rPr>
+          <w:rFonts w:ascii="Garamond" w:hAnsi="Garamond"/>
+          <w:color w:val="000000" w:themeColor="text1"/>
+        </w:rPr>
+      </w:pPr>
+      <w:r>
+        <w:rPr>
+          <w:rFonts w:ascii="Garamond" w:hAnsi="Garamond"/>
+          <w:b/>
+          <w:bCs/>
+          <w:color w:val="000000" w:themeColor="text1"/>
+        </w:rPr>
         <w:t>Postdoctoral Research Fellow</w:t>
       </w:r>
       <w:r>
@@ -1479,6 +1515,67 @@
     </w:p>
     <w:p>
       <w:pPr>
+        <w:pStyle w:val="ListParagraph"/>
+        <w:numPr>
+          <w:ilvl w:val="0"/>
+          <w:numId w:val="2"/>
+        </w:numPr>
+        <w:spacing w:after="80"/>
+        <w:rPr>
+          <w:rFonts w:ascii="Garamond" w:hAnsi="Garamond"/>
+          <w:color w:val="000000" w:themeColor="text1"/>
+        </w:rPr>
+      </w:pPr>
+      <w:r>
+        <w:rPr>
+          <w:rFonts w:ascii="Garamond" w:hAnsi="Garamond"/>
+          <w:b/>
+          <w:bCs/>
+          <w:color w:val="000000" w:themeColor="text1"/>
+        </w:rPr>
+        <w:t xml:space="preserve">Yifat Aran</w:t>
+      </w:r>
+      <w:r>
+        <w:rPr>
+          <w:rFonts w:ascii="Garamond" w:hAnsi="Garamond"/>
+          <w:color w:val="000000" w:themeColor="text1"/>
+        </w:rPr>
+        <w:t xml:space="preserve">, </w:t>
+      </w:r>
+      <w:r>
+        <w:rPr>
+          <w:rFonts w:ascii="Garamond" w:hAnsi="Garamond"/>
+          <w:i/>
+          <w:iCs/>
+          <w:color w:val="000000" w:themeColor="text1"/>
+        </w:rPr>
+        <w:t xml:space="preserve">The Optional Firm: The Silicon Valley Model of Startup Organization</w:t>
+      </w:r>
+      <w:r>
+        <w:rPr>
+          <w:rFonts w:ascii="Garamond" w:hAnsi="Garamond"/>
+          <w:color w:val="000000" w:themeColor="text1"/>
+        </w:rPr>
+        <w:t xml:space="preserve"> (forthcoming, </w:t>
+      </w:r>
+      <w:r>
+        <w:rPr>
+          <w:rFonts w:ascii="Garamond" w:hAnsi="Garamond"/>
+          <w:smallCaps/>
+          <w:color w:val="000000" w:themeColor="text1"/>
+        </w:rPr>
+        <w:t xml:space="preserve">European Business Law Review</w:t>
+      </w:r>
+      <w:r>
+        <w:rPr>
+          <w:rFonts w:ascii="Garamond" w:hAnsi="Garamond"/>
+          <w:color w:val="000000" w:themeColor="text1"/>
+        </w:rPr>
+        <w:t xml:space="preserve">).</w:t>
+      </w:r>
+    </w:p>
+    <w:p>
+      <w:pPr>
         <w:pStyle w:val="Heading2"/>
         <w:keepNext/>
         <w:keepLines/>
@@ -1672,54 +1769,6 @@
       <w:r>
         <w:rPr>
           <w:rFonts w:ascii="Garamond" w:hAnsi="Garamond"/>
-          <w:b/>
-          <w:bCs/>
-          <w:color w:val="000000" w:themeColor="text1"/>
-        </w:rPr>
-        <w:t xml:space="preserve">Yifat Aran</w:t>
-      </w:r>
-      <w:r>
-        <w:rPr>
-          <w:rFonts w:ascii="Garamond" w:hAnsi="Garamond"/>
-          <w:bCs/>
-          <w:color w:val="000000" w:themeColor="text1"/>
-        </w:rPr>
-        <w:t xml:space="preserve">, </w:t>
-      </w:r>
-      <w:r>
-        <w:rPr>
-          <w:rFonts w:ascii="Garamond" w:hAnsi="Garamond"/>
-          <w:bCs/>
-          <w:color w:val="000000" w:themeColor="text1"/>
-          <w:i/>
-        </w:rPr>
-        <w:t xml:space="preserve">The Optional Firm</w:t>
-      </w:r>
-      <w:r>
-        <w:rPr>
-          <w:rFonts w:ascii="Garamond" w:hAnsi="Garamond"/>
-          <w:bCs/>
-          <w:color w:val="000000" w:themeColor="text1"/>
-        </w:rPr>
-        <w:t xml:space="preserve">.</w:t>
-      </w:r>
-    </w:p>
-    <w:p>
-      <w:pPr>
-        <w:pStyle w:val="ListParagraph"/>
-        <w:numPr>
-          <w:ilvl w:val="0"/>
-          <w:numId w:val="10"/>
-        </w:numPr>
-        <w:spacing w:after="80"/>
-        <w:rPr>
-          <w:rFonts w:ascii="Garamond" w:hAnsi="Garamond"/>
-          <w:color w:val="000000" w:themeColor="text1"/>
-        </w:rPr>
-      </w:pPr>
-      <w:r>
-        <w:rPr>
-          <w:rFonts w:ascii="Garamond" w:hAnsi="Garamond"/>
           <w:bCs/>
           <w:color w:val="000000" w:themeColor="text1"/>
         </w:rPr>
@@ -2976,47 +3025,6 @@
           <w:color w:val="000000" w:themeColor="text1"/>
         </w:rPr>
         <w:t>. Israel Science Foundation (ISF). ₪561,000.</w:t>
-      </w:r>
-    </w:p>
-    <w:p>
-      <w:pPr>
-        <w:spacing w:after="80"/>
-        <w:rPr>
-          <w:rFonts w:ascii="Garamond" w:hAnsi="Garamond"/>
-          <w:color w:val="000000" w:themeColor="text1"/>
-        </w:rPr>
-      </w:pPr>
-      <w:r>
-        <w:rPr>
-          <w:rFonts w:ascii="Garamond" w:hAnsi="Garamond"/>
-          <w:b/>
-          <w:bCs/>
-          <w:color w:val="000000" w:themeColor="text1"/>
-        </w:rPr>
-        <w:t xml:space="preserve">2024  </w:t>
-      </w:r>
-      <w:r>
-        <w:rPr>
-          <w:rFonts w:ascii="Garamond" w:hAnsi="Garamond"/>
-          <w:color w:val="000000" w:themeColor="text1"/>
-        </w:rPr>
-        <w:t xml:space="preserve">Co-PI. </w:t>
-      </w:r>
-      <w:r>
-        <w:rPr>
-          <w:rFonts w:ascii="Garamond" w:hAnsi="Garamond"/>
-          <w:i/>
-          <w:iCs/>
-          <w:color w:val="000000" w:themeColor="text1"/>
-        </w:rPr>
-        <w:t>Secondary Sales of Startup Employee Stock in the US and Israel (with Brian Broughman)</w:t>
-      </w:r>
-      <w:r>
-        <w:rPr>
-          <w:rFonts w:ascii="Garamond" w:hAnsi="Garamond"/>
-          <w:color w:val="000000" w:themeColor="text1"/>
-        </w:rPr>
-        <w:t>. Vanderbilt University. $10,000.</w:t>
       </w:r>
     </w:p>
     <w:p>

</xml_diff>